<commit_message>
docs: actualizar resúmenes CTOs y agencias con 6 frameworks completos
CTOs:
- Sección frameworks complementarios detallada técnicamente
- ISO 38507, OECD, ICO UK, IEEE EAD
- Énfasis en integración de 6 frameworks

Agencias Marketing:
- Sección frameworks simplificada para audiencia no técnica
- Mensaje clave: mejores prácticas mundiales
- Lenguaje accesible sin tecnicismos

Cobertura completa: EU AI Act + GDPR + ISO 42001 + ISO 38507 + ISO 23894 + OECD + ICO UK + IEEE
</commit_message>
<xml_diff>
--- a/docs/lanzamiento/RESUMEN_AGENCIAS_MARKETING.docx
+++ b/docs/lanzamiento/RESUMEN_AGENCIAS_MARKETING.docx
@@ -2,7 +2,7 @@
 <file path=word/document.xml><?xml version="1.0" encoding="utf-8"?>
 <w:document xmlns:w="http://schemas.openxmlformats.org/wordprocessingml/2006/main" xmlns:m="http://schemas.openxmlformats.org/officeDocument/2006/math" xmlns:r="http://schemas.openxmlformats.org/officeDocument/2006/relationships" xmlns:o="urn:schemas-microsoft-com:office:office" xmlns:v="urn:schemas-microsoft-com:vml" xmlns:w10="urn:schemas-microsoft-com:office:word" xmlns:a="http://schemas.openxmlformats.org/drawingml/2006/main" xmlns:pic="http://schemas.openxmlformats.org/drawingml/2006/picture" xmlns:wp="http://schemas.openxmlformats.org/drawingml/2006/wordprocessingDrawing">
   <w:body>
-    <w:bookmarkStart w:id="39" w:name="X3b16bd7254387376c1eafe393e59b92088b4c3a"/>
+    <w:bookmarkStart w:id="40" w:name="X3b16bd7254387376c1eafe393e59b92088b4c3a"/>
     <w:p>
       <w:pPr>
         <w:pStyle w:val="Heading1"/>
@@ -78,7 +78,7 @@
       </w:r>
     </w:p>
     <w:bookmarkEnd w:id="20"/>
-    <w:bookmarkStart w:id="25" w:name="Xaeb378b96ca75882a935177d097c56120ee73f5"/>
+    <w:bookmarkStart w:id="26" w:name="Xaeb378b96ca75882a935177d097c56120ee73f5"/>
     <w:p>
       <w:pPr>
         <w:pStyle w:val="Heading2"/>
@@ -806,6 +806,136 @@
           <w:b/>
         </w:rPr>
         <w:t xml:space="preserve">Total: 32 artículos aplicables + 13 anexos técnicos cubiertos por CodeflowX</w:t>
+      </w:r>
+    </w:p>
+    <w:bookmarkEnd w:id="24"/>
+    <w:bookmarkStart w:id="25" w:name="certificaciones-y-estándares-adicionales"/>
+    <w:p>
+      <w:pPr>
+        <w:pStyle w:val="Heading3"/>
+      </w:pPr>
+      <w:r>
+        <w:rPr>
+          <w:bCs/>
+          <w:b/>
+        </w:rPr>
+        <w:t xml:space="preserve">Certificaciones y Estándares Adicionales</w:t>
+      </w:r>
+    </w:p>
+    <w:p>
+      <w:pPr>
+        <w:pStyle w:val="FirstParagraph"/>
+      </w:pPr>
+      <w:r>
+        <w:t xml:space="preserve">CodeflowX no solo cumple EU AI Act, también implementa:</w:t>
+      </w:r>
+    </w:p>
+    <w:p>
+      <w:pPr>
+        <w:pStyle w:val="BodyText"/>
+      </w:pPr>
+      <w:r>
+        <w:rPr>
+          <w:bCs/>
+          <w:b/>
+        </w:rPr>
+        <w:t xml:space="preserve">Normativas Europeas:</w:t>
+      </w:r>
+      <w:r>
+        <w:t xml:space="preserve"> </w:t>
+      </w:r>
+      <w:r>
+        <w:t xml:space="preserve">- RGPD (protección datos personales): Integración completa</w:t>
+      </w:r>
+      <w:r>
+        <w:t xml:space="preserve"> </w:t>
+      </w:r>
+      <w:r>
+        <w:t xml:space="preserve">- Directiva Derechos Autor UE: Para contenido generado con IA</w:t>
+      </w:r>
+    </w:p>
+    <w:p>
+      <w:pPr>
+        <w:pStyle w:val="BodyText"/>
+      </w:pPr>
+      <w:r>
+        <w:rPr>
+          <w:bCs/>
+          <w:b/>
+        </w:rPr>
+        <w:t xml:space="preserve">Certificaciones Internacionales:</w:t>
+      </w:r>
+      <w:r>
+        <w:t xml:space="preserve"> </w:t>
+      </w:r>
+      <w:r>
+        <w:t xml:space="preserve">- ISO 42001: Sistema de gestión de IA (estándar mundial)</w:t>
+      </w:r>
+      <w:r>
+        <w:t xml:space="preserve"> </w:t>
+      </w:r>
+      <w:r>
+        <w:t xml:space="preserve">- ISO 38507: Gobernanza de TI para IA</w:t>
+      </w:r>
+      <w:r>
+        <w:t xml:space="preserve"> </w:t>
+      </w:r>
+      <w:r>
+        <w:t xml:space="preserve">- ISO 23894: Gestión de riesgos de IA</w:t>
+      </w:r>
+    </w:p>
+    <w:p>
+      <w:pPr>
+        <w:pStyle w:val="BodyText"/>
+      </w:pPr>
+      <w:r>
+        <w:rPr>
+          <w:bCs/>
+          <w:b/>
+        </w:rPr>
+        <w:t xml:space="preserve">Buenas Prácticas Internacionales:</w:t>
+      </w:r>
+      <w:r>
+        <w:t xml:space="preserve"> </w:t>
+      </w:r>
+      <w:r>
+        <w:t xml:space="preserve">- OECD AI Principles: Principios éticos IA (adoptados por 50+ países)</w:t>
+      </w:r>
+      <w:r>
+        <w:t xml:space="preserve"> </w:t>
+      </w:r>
+      <w:r>
+        <w:t xml:space="preserve">- ICO UK: Guía protección datos en IA (Reino Unido)</w:t>
+      </w:r>
+      <w:r>
+        <w:t xml:space="preserve"> </w:t>
+      </w:r>
+      <w:r>
+        <w:t xml:space="preserve">- IEEE Ethical AI: Diseño IA ético</w:t>
+      </w:r>
+    </w:p>
+    <w:p>
+      <w:pPr>
+        <w:pStyle w:val="BodyText"/>
+      </w:pPr>
+      <w:r>
+        <w:rPr>
+          <w:bCs/>
+          <w:b/>
+        </w:rPr>
+        <w:t xml:space="preserve">Mensaje para clientes:</w:t>
+      </w:r>
+      <w:r>
+        <w:t xml:space="preserve"> </w:t>
+      </w:r>
+      <w:r>
+        <w:t xml:space="preserve">“</w:t>
+      </w:r>
+      <w:r>
+        <w:t xml:space="preserve">No solo cumplimos la ley europea, seguimos mejores prácticas mundiales</w:t>
+      </w:r>
+      <w:r>
+        <w:t xml:space="preserve">”</w:t>
       </w:r>
     </w:p>
     <w:p>
@@ -815,9 +945,9 @@
         </w:pict>
       </w:r>
     </w:p>
-    <w:bookmarkEnd w:id="24"/>
     <w:bookmarkEnd w:id="25"/>
-    <w:bookmarkStart w:id="30" w:name="X336a1f49b63b181256ad88e7084e8201580aa57"/>
+    <w:bookmarkEnd w:id="26"/>
+    <w:bookmarkStart w:id="31" w:name="X336a1f49b63b181256ad88e7084e8201580aa57"/>
     <w:p>
       <w:pPr>
         <w:pStyle w:val="Heading2"/>
@@ -826,7 +956,7 @@
         <w:t xml:space="preserve">DIAPOSITIVA 2: MODELO DE PARTNER - TU BENEFICIO</w:t>
       </w:r>
     </w:p>
-    <w:bookmarkStart w:id="26" w:name="qué-ganas-como-partner-codeflowx"/>
+    <w:bookmarkStart w:id="27" w:name="qué-ganas-como-partner-codeflowx"/>
     <w:p>
       <w:pPr>
         <w:pStyle w:val="Heading3"/>
@@ -1031,8 +1161,8 @@
         <w:t xml:space="preserve">- Account manager dedicado</w:t>
       </w:r>
     </w:p>
-    <w:bookmarkEnd w:id="26"/>
-    <w:bookmarkStart w:id="27" w:name="cómo-funciona-el-partner-program"/>
+    <w:bookmarkEnd w:id="27"/>
+    <w:bookmarkStart w:id="28" w:name="cómo-funciona-el-partner-program"/>
     <w:p>
       <w:pPr>
         <w:pStyle w:val="Heading3"/>
@@ -1147,8 +1277,8 @@
         <w:t xml:space="preserve">- Referencias clientes → Cierra más deals</w:t>
       </w:r>
     </w:p>
-    <w:bookmarkEnd w:id="27"/>
-    <w:bookmarkStart w:id="28" w:name="casos-de-uso-para-tus-clientes"/>
+    <w:bookmarkEnd w:id="28"/>
+    <w:bookmarkStart w:id="29" w:name="casos-de-uso-para-tus-clientes"/>
     <w:p>
       <w:pPr>
         <w:pStyle w:val="Heading3"/>
@@ -1419,8 +1549,8 @@
         <w:t xml:space="preserve">- Recomendaciones cursos con IA → Requiere Art. 10</w:t>
       </w:r>
     </w:p>
-    <w:bookmarkEnd w:id="28"/>
-    <w:bookmarkStart w:id="29" w:name="qué-no-necesitas-saber-lo-hace-codeflowx"/>
+    <w:bookmarkEnd w:id="29"/>
+    <w:bookmarkStart w:id="30" w:name="qué-no-necesitas-saber-lo-hace-codeflowx"/>
     <w:p>
       <w:pPr>
         <w:pStyle w:val="Heading3"/>
@@ -1480,9 +1610,9 @@
         </w:pict>
       </w:r>
     </w:p>
-    <w:bookmarkEnd w:id="29"/>
     <w:bookmarkEnd w:id="30"/>
-    <w:bookmarkStart w:id="36" w:name="diapositiva-3-programa-partner-urgencia"/>
+    <w:bookmarkEnd w:id="31"/>
+    <w:bookmarkStart w:id="37" w:name="diapositiva-3-programa-partner-urgencia"/>
     <w:p>
       <w:pPr>
         <w:pStyle w:val="Heading2"/>
@@ -1491,7 +1621,7 @@
         <w:t xml:space="preserve">DIAPOSITIVA 3: PROGRAMA PARTNER + URGENCIA</w:t>
       </w:r>
     </w:p>
-    <w:bookmarkStart w:id="31" w:name="números-reales---ahorro-cliente"/>
+    <w:bookmarkStart w:id="32" w:name="números-reales---ahorro-cliente"/>
     <w:p>
       <w:pPr>
         <w:pStyle w:val="Heading3"/>
@@ -1610,8 +1740,8 @@
         <w:t xml:space="preserve">”</w:t>
       </w:r>
     </w:p>
-    <w:bookmarkEnd w:id="31"/>
-    <w:bookmarkStart w:id="32" w:name="timeline-urgencia---por-qué-ahora"/>
+    <w:bookmarkEnd w:id="32"/>
+    <w:bookmarkStart w:id="33" w:name="timeline-urgencia---por-qué-ahora"/>
     <w:p>
       <w:pPr>
         <w:pStyle w:val="Heading3"/>
@@ -1886,8 +2016,8 @@
         <w:t xml:space="preserve">- Clientes pagarán premium por reducir riesgo</w:t>
       </w:r>
     </w:p>
-    <w:bookmarkEnd w:id="32"/>
-    <w:bookmarkStart w:id="33" w:name="condiciones-partner-program"/>
+    <w:bookmarkEnd w:id="33"/>
+    <w:bookmarkStart w:id="34" w:name="condiciones-partner-program"/>
     <w:p>
       <w:pPr>
         <w:pStyle w:val="Heading3"/>
@@ -2094,8 +2224,8 @@
         <w:t xml:space="preserve">65K€ revenue adicional</w:t>
       </w:r>
     </w:p>
-    <w:bookmarkEnd w:id="33"/>
-    <w:bookmarkStart w:id="34" w:name="diferenciación-vs-competencia-agencias"/>
+    <w:bookmarkEnd w:id="34"/>
+    <w:bookmarkStart w:id="35" w:name="diferenciación-vs-competencia-agencias"/>
     <w:p>
       <w:pPr>
         <w:pStyle w:val="Heading3"/>
@@ -2471,8 +2601,8 @@
         </w:pict>
       </w:r>
     </w:p>
-    <w:bookmarkEnd w:id="34"/>
-    <w:bookmarkStart w:id="35" w:name="próximos-pasos---convertirte-en-partner"/>
+    <w:bookmarkEnd w:id="35"/>
+    <w:bookmarkStart w:id="36" w:name="próximos-pasos---convertirte-en-partner"/>
     <w:p>
       <w:pPr>
         <w:pStyle w:val="Heading3"/>
@@ -2618,9 +2748,9 @@
         </w:pict>
       </w:r>
     </w:p>
-    <w:bookmarkEnd w:id="35"/>
     <w:bookmarkEnd w:id="36"/>
-    <w:bookmarkStart w:id="37" w:name="contacto-partner-program"/>
+    <w:bookmarkEnd w:id="37"/>
+    <w:bookmarkStart w:id="38" w:name="contacto-partner-program"/>
     <w:p>
       <w:pPr>
         <w:pStyle w:val="Heading2"/>
@@ -2747,8 +2877,8 @@
         </w:pict>
       </w:r>
     </w:p>
-    <w:bookmarkEnd w:id="37"/>
-    <w:bookmarkStart w:id="38" w:name="anexo---preguntas-frecuentes-partners"/>
+    <w:bookmarkEnd w:id="38"/>
+    <w:bookmarkStart w:id="39" w:name="anexo---preguntas-frecuentes-partners"/>
     <w:p>
       <w:pPr>
         <w:pStyle w:val="Heading2"/>
@@ -2883,8 +3013,8 @@
         <w:t xml:space="preserve">R: Sí, perfecto. Cross-sell a cartera actual es el mejor inicio.</w:t>
       </w:r>
     </w:p>
-    <w:bookmarkEnd w:id="38"/>
     <w:bookmarkEnd w:id="39"/>
+    <w:bookmarkEnd w:id="40"/>
     <w:sectPr/>
   </w:body>
 </w:document>

</xml_diff>